<commit_message>
docs(spec-03/07/08/09): admin allowlist 3 -> 4 (add piyadad)
Backend ADMIN_EMAILS already has 4 admins; signoff docs lagged at 3.
Add piyadad@chememan.com (ปิยะดา ดวงพลจันทร์) to admin list + bump
versions/changelog. Docs 07/08 committed for the first time (were
untracked). gl-group build script: annotate() now falls back to the
committed asset when the temp raw screenshot is absent, so text-only
doc rebuilds no longer require recapturing.

Co-Authored-By: Claude Fable 5 <noreply@anthropic.com>
</commit_message>
<xml_diff>
--- a/requirement_spec/1_software_dev/1.1_frontend/signoff_spec/03_edit_gl_group_spec.docx
+++ b/requirement_spec/1_software_dev/1.1_frontend/signoff_spec/03_edit_gl_group_spec.docx
@@ -654,6 +654,86 @@
           </w:p>
         </w:tc>
       </w:tr>
+      <w:tr>
+        <w:tc>
+          <w:tcPr>
+            <w:tcW w:w="1400" w:type="dxa"/>
+            <w:tcMar>
+              <w:top w:w="40" w:type="dxa"/>
+              <w:bottom w:w="40" w:type="dxa"/>
+              <w:left w:w="80" w:type="dxa"/>
+              <w:right w:w="80" w:type="dxa"/>
+            </w:tcMar>
+            <w:vAlign w:val="center"/>
+          </w:tcPr>
+          <w:p>
+            <w:pPr>
+              <w:rFonts w:ascii="Leelawadee UI" w:hAnsi="Leelawadee UI" w:cs="Leelawadee UI"/>
+              <w:spacing w:before="20" w:after="20"/>
+            </w:pPr>
+            <w:r>
+              <w:rPr>
+                <w:rFonts w:ascii="Leelawadee UI" w:hAnsi="Leelawadee UI" w:cs="Leelawadee UI"/>
+                <w:sz w:val="17"/>
+                <w:szCs w:val="17"/>
+              </w:rPr>
+              <w:t xml:space="preserve">v0.2.1</w:t>
+            </w:r>
+          </w:p>
+        </w:tc>
+        <w:tc>
+          <w:tcPr>
+            <w:tcW w:w="2000" w:type="dxa"/>
+            <w:tcMar>
+              <w:top w:w="40" w:type="dxa"/>
+              <w:bottom w:w="40" w:type="dxa"/>
+              <w:left w:w="80" w:type="dxa"/>
+              <w:right w:w="80" w:type="dxa"/>
+            </w:tcMar>
+            <w:vAlign w:val="center"/>
+          </w:tcPr>
+          <w:p>
+            <w:pPr>
+              <w:rFonts w:ascii="Leelawadee UI" w:hAnsi="Leelawadee UI" w:cs="Leelawadee UI"/>
+              <w:spacing w:before="20" w:after="20"/>
+            </w:pPr>
+            <w:r>
+              <w:rPr>
+                <w:rFonts w:ascii="Leelawadee UI" w:hAnsi="Leelawadee UI" w:cs="Leelawadee UI"/>
+                <w:sz w:val="17"/>
+                <w:szCs w:val="17"/>
+              </w:rPr>
+              <w:t xml:space="preserve">2026-06-11</w:t>
+            </w:r>
+          </w:p>
+        </w:tc>
+        <w:tc>
+          <w:tcPr>
+            <w:tcW w:w="5960" w:type="dxa"/>
+            <w:tcMar>
+              <w:top w:w="40" w:type="dxa"/>
+              <w:bottom w:w="40" w:type="dxa"/>
+              <w:left w:w="80" w:type="dxa"/>
+              <w:right w:w="80" w:type="dxa"/>
+            </w:tcMar>
+            <w:vAlign w:val="center"/>
+          </w:tcPr>
+          <w:p>
+            <w:pPr>
+              <w:rFonts w:ascii="Leelawadee UI" w:hAnsi="Leelawadee UI" w:cs="Leelawadee UI"/>
+              <w:spacing w:before="20" w:after="20"/>
+            </w:pPr>
+            <w:r>
+              <w:rPr>
+                <w:rFonts w:ascii="Leelawadee UI" w:hAnsi="Leelawadee UI" w:cs="Leelawadee UI"/>
+                <w:sz w:val="17"/>
+                <w:szCs w:val="17"/>
+              </w:rPr>
+              <w:t xml:space="preserve">แก้ไขรายชื่อผู้ดูแลระบบจาก 3 คน เป็น 4 คน: เพิ่ม piyadad@chememan.com (ปิยะดา ดวงพลจันทร์)</w:t>
+            </w:r>
+          </w:p>
+        </w:tc>
+      </w:tr>
     </w:tbl>
     <w:p>
       <w:pPr>
@@ -715,7 +795,7 @@
           <w:sz w:val="22"/>
           <w:szCs w:val="22"/>
         </w:rPr>
-        <w:t xml:space="preserve">ผู้ดูแลระบบที่ได้รับสิทธิ์ (3 คน)</w:t>
+        <w:t xml:space="preserve">ผู้ดูแลระบบที่ได้รับสิทธิ์ (4 คน)</w:t>
       </w:r>
     </w:p>
     <w:p>
@@ -758,6 +838,20 @@
           <w:szCs w:val="22"/>
         </w:rPr>
         <w:t xml:space="preserve">•  jakkaritw@chememan.com</w:t>
+      </w:r>
+    </w:p>
+    <w:p>
+      <w:pPr>
+        <w:rFonts w:ascii="Leelawadee UI" w:hAnsi="Leelawadee UI" w:cs="Leelawadee UI"/>
+        <w:spacing w:before="0" w:after="60"/>
+      </w:pPr>
+      <w:r>
+        <w:rPr>
+          <w:rFonts w:ascii="Leelawadee UI" w:hAnsi="Leelawadee UI" w:cs="Leelawadee UI"/>
+          <w:sz w:val="22"/>
+          <w:szCs w:val="22"/>
+        </w:rPr>
+        <w:t xml:space="preserve">•  piyadad@chememan.com  (ปิยะดา ดวงพลจันทร์)</w:t>
       </w:r>
     </w:p>
     <w:p>

</xml_diff>